<commit_message>
Servidor 23022026 e Uploads
</commit_message>
<xml_diff>
--- a/uploads/Proposta/PropostaCFC FIGHT NIGHT_BIG SIGMA_.docx
+++ b/uploads/Proposta/PropostaCFC FIGHT NIGHT_BIG SIGMA_.docx
@@ -1219,7 +1219,7 @@
           <w:sz w:val="24"/>
           <w:szCs w:val="24"/>
         </w:rPr>
-        <w:t xml:space="preserve">R$ 3.726,00</w:t>
+        <w:t xml:space="preserve">R$ 6.000,00</w:t>
       </w:r>
       <w:r>
         <w:rPr>
@@ -1398,7 +1398,7 @@
           <w:i/>
           <w:iCs/>
         </w:rPr>
-        <w:t xml:space="preserve">18/02/2026</w:t>
+        <w:t xml:space="preserve">20/02/2026</w:t>
       </w:r>
     </w:p>
     <w:p>

</xml_diff>